<commit_message>
Konzept von Grundlagen fertig
</commit_message>
<xml_diff>
--- a/Konzepte/Grundlagen.docx
+++ b/Konzepte/Grundlagen.docx
@@ -2208,6 +2208,987 @@
           <w:szCs w:val="24"/>
         </w:rPr>
       </w:pPr>
+    </w:p>
+    <w:p>
+      <w:pPr>
+        <w:rPr>
+          <w:sz w:val="24"/>
+          <w:szCs w:val="24"/>
+        </w:rPr>
+      </w:pPr>
+      <w:r>
+        <w:rPr>
+          <w:sz w:val="24"/>
+          <w:szCs w:val="24"/>
+        </w:rPr>
+        <w:t>Matrizen:</w:t>
+      </w:r>
+    </w:p>
+    <w:p>
+      <w:pPr>
+        <w:pStyle w:val="Listenabsatz"/>
+        <w:numPr>
+          <w:ilvl w:val="0"/>
+          <w:numId w:val="2"/>
+        </w:numPr>
+        <w:rPr>
+          <w:sz w:val="24"/>
+          <w:szCs w:val="24"/>
+        </w:rPr>
+      </w:pPr>
+      <w:r>
+        <w:rPr>
+          <w:sz w:val="24"/>
+          <w:szCs w:val="24"/>
+        </w:rPr>
+        <w:t>Matrix aus einer Zahl erzeugen</w:t>
+      </w:r>
+    </w:p>
+    <w:p>
+      <w:pPr>
+        <w:pStyle w:val="Listenabsatz"/>
+        <w:numPr>
+          <w:ilvl w:val="1"/>
+          <w:numId w:val="2"/>
+        </w:numPr>
+        <w:rPr>
+          <w:sz w:val="24"/>
+          <w:szCs w:val="24"/>
+        </w:rPr>
+      </w:pPr>
+      <w:r>
+        <w:rPr>
+          <w:sz w:val="24"/>
+          <w:szCs w:val="24"/>
+        </w:rPr>
+        <w:t>Dimensionen müssen angegeben werden</w:t>
+      </w:r>
+    </w:p>
+    <w:p>
+      <w:pPr>
+        <w:pStyle w:val="Listenabsatz"/>
+        <w:ind w:left="1440"/>
+        <w:rPr>
+          <w:sz w:val="24"/>
+          <w:szCs w:val="24"/>
+        </w:rPr>
+      </w:pPr>
+    </w:p>
+    <w:p>
+      <w:pPr>
+        <w:pStyle w:val="Listenabsatz"/>
+        <w:numPr>
+          <w:ilvl w:val="0"/>
+          <w:numId w:val="2"/>
+        </w:numPr>
+        <w:rPr>
+          <w:sz w:val="24"/>
+          <w:szCs w:val="24"/>
+        </w:rPr>
+      </w:pPr>
+      <w:r>
+        <w:rPr>
+          <w:sz w:val="24"/>
+          <w:szCs w:val="24"/>
+        </w:rPr>
+        <w:t>Matrix aus Vector erzeugen</w:t>
+      </w:r>
+    </w:p>
+    <w:p>
+      <w:pPr>
+        <w:pStyle w:val="Listenabsatz"/>
+        <w:numPr>
+          <w:ilvl w:val="1"/>
+          <w:numId w:val="2"/>
+        </w:numPr>
+        <w:rPr>
+          <w:sz w:val="24"/>
+          <w:szCs w:val="24"/>
+        </w:rPr>
+      </w:pPr>
+      <w:proofErr w:type="spellStart"/>
+      <w:r>
+        <w:rPr>
+          <w:sz w:val="24"/>
+          <w:szCs w:val="24"/>
+        </w:rPr>
+        <w:t>byrow</w:t>
+      </w:r>
+      <w:proofErr w:type="spellEnd"/>
+      <w:r>
+        <w:rPr>
+          <w:sz w:val="24"/>
+          <w:szCs w:val="24"/>
+        </w:rPr>
+        <w:t xml:space="preserve"> = TRUE vs. </w:t>
+      </w:r>
+      <w:proofErr w:type="spellStart"/>
+      <w:r>
+        <w:rPr>
+          <w:sz w:val="24"/>
+          <w:szCs w:val="24"/>
+        </w:rPr>
+        <w:t>byrow</w:t>
+      </w:r>
+      <w:proofErr w:type="spellEnd"/>
+      <w:r>
+        <w:rPr>
+          <w:sz w:val="24"/>
+          <w:szCs w:val="24"/>
+        </w:rPr>
+        <w:t xml:space="preserve"> = FALSE</w:t>
+      </w:r>
+    </w:p>
+    <w:p>
+      <w:pPr>
+        <w:pStyle w:val="Listenabsatz"/>
+        <w:ind w:left="1440"/>
+        <w:rPr>
+          <w:sz w:val="24"/>
+          <w:szCs w:val="24"/>
+        </w:rPr>
+      </w:pPr>
+    </w:p>
+    <w:p>
+      <w:pPr>
+        <w:pStyle w:val="Listenabsatz"/>
+        <w:numPr>
+          <w:ilvl w:val="0"/>
+          <w:numId w:val="2"/>
+        </w:numPr>
+        <w:rPr>
+          <w:sz w:val="24"/>
+          <w:szCs w:val="24"/>
+        </w:rPr>
+      </w:pPr>
+      <w:r>
+        <w:rPr>
+          <w:sz w:val="24"/>
+          <w:szCs w:val="24"/>
+        </w:rPr>
+        <w:t>Indizierung ist das wichtigste!</w:t>
+      </w:r>
+    </w:p>
+    <w:p>
+      <w:pPr>
+        <w:pStyle w:val="Listenabsatz"/>
+        <w:numPr>
+          <w:ilvl w:val="1"/>
+          <w:numId w:val="2"/>
+        </w:numPr>
+        <w:rPr>
+          <w:sz w:val="24"/>
+          <w:szCs w:val="24"/>
+        </w:rPr>
+      </w:pPr>
+      <w:r>
+        <w:rPr>
+          <w:sz w:val="24"/>
+          <w:szCs w:val="24"/>
+        </w:rPr>
+        <w:t>In der Regel arbeitet man selten mit Matrizen</w:t>
+      </w:r>
+    </w:p>
+    <w:p>
+      <w:pPr>
+        <w:pStyle w:val="Listenabsatz"/>
+        <w:numPr>
+          <w:ilvl w:val="1"/>
+          <w:numId w:val="2"/>
+        </w:numPr>
+        <w:rPr>
+          <w:sz w:val="24"/>
+          <w:szCs w:val="24"/>
+        </w:rPr>
+      </w:pPr>
+      <w:r>
+        <w:rPr>
+          <w:sz w:val="24"/>
+          <w:szCs w:val="24"/>
+        </w:rPr>
+        <w:t>Aber die Indizierung ist identisch mit Dataframes</w:t>
+      </w:r>
+    </w:p>
+    <w:p>
+      <w:pPr>
+        <w:pStyle w:val="Listenabsatz"/>
+        <w:numPr>
+          <w:ilvl w:val="3"/>
+          <w:numId w:val="2"/>
+        </w:numPr>
+        <w:rPr>
+          <w:sz w:val="24"/>
+          <w:szCs w:val="24"/>
+        </w:rPr>
+      </w:pPr>
+      <w:r>
+        <w:rPr>
+          <w:sz w:val="24"/>
+          <w:szCs w:val="24"/>
+        </w:rPr>
+        <w:t>Sehr wichtig</w:t>
+      </w:r>
+    </w:p>
+    <w:p>
+      <w:pPr>
+        <w:pStyle w:val="Listenabsatz"/>
+        <w:numPr>
+          <w:ilvl w:val="1"/>
+          <w:numId w:val="2"/>
+        </w:numPr>
+        <w:rPr>
+          <w:sz w:val="24"/>
+          <w:szCs w:val="24"/>
+        </w:rPr>
+      </w:pPr>
+      <w:r>
+        <w:rPr>
+          <w:sz w:val="24"/>
+          <w:szCs w:val="24"/>
+        </w:rPr>
+        <w:t xml:space="preserve">Bei Indizierung jetzt 2 Indices </w:t>
+      </w:r>
+      <w:proofErr w:type="gramStart"/>
+      <w:r>
+        <w:rPr>
+          <w:sz w:val="24"/>
+          <w:szCs w:val="24"/>
+        </w:rPr>
+        <w:t>mit ,</w:t>
+      </w:r>
+      <w:proofErr w:type="gramEnd"/>
+      <w:r>
+        <w:rPr>
+          <w:sz w:val="24"/>
+          <w:szCs w:val="24"/>
+        </w:rPr>
+        <w:t xml:space="preserve"> getrennt [ , ]</w:t>
+      </w:r>
+    </w:p>
+    <w:p>
+      <w:pPr>
+        <w:pStyle w:val="Listenabsatz"/>
+        <w:numPr>
+          <w:ilvl w:val="1"/>
+          <w:numId w:val="2"/>
+        </w:numPr>
+        <w:rPr>
+          <w:sz w:val="24"/>
+          <w:szCs w:val="24"/>
+        </w:rPr>
+      </w:pPr>
+      <w:r>
+        <w:rPr>
+          <w:sz w:val="24"/>
+          <w:szCs w:val="24"/>
+        </w:rPr>
+        <w:t>Ganze Zeilen [1</w:t>
+      </w:r>
+      <w:proofErr w:type="gramStart"/>
+      <w:r>
+        <w:rPr>
+          <w:sz w:val="24"/>
+          <w:szCs w:val="24"/>
+        </w:rPr>
+        <w:t>, ]</w:t>
+      </w:r>
+      <w:proofErr w:type="gramEnd"/>
+    </w:p>
+    <w:p>
+      <w:pPr>
+        <w:pStyle w:val="Listenabsatz"/>
+        <w:numPr>
+          <w:ilvl w:val="1"/>
+          <w:numId w:val="2"/>
+        </w:numPr>
+        <w:rPr>
+          <w:sz w:val="24"/>
+          <w:szCs w:val="24"/>
+        </w:rPr>
+      </w:pPr>
+      <w:r>
+        <w:rPr>
+          <w:sz w:val="24"/>
+          <w:szCs w:val="24"/>
+        </w:rPr>
+        <w:t>Ganze Spalten [ ,1]</w:t>
+      </w:r>
+    </w:p>
+    <w:p>
+      <w:pPr>
+        <w:pStyle w:val="Listenabsatz"/>
+        <w:numPr>
+          <w:ilvl w:val="1"/>
+          <w:numId w:val="2"/>
+        </w:numPr>
+        <w:rPr>
+          <w:sz w:val="24"/>
+          <w:szCs w:val="24"/>
+        </w:rPr>
+      </w:pPr>
+      <w:r>
+        <w:rPr>
+          <w:sz w:val="24"/>
+          <w:szCs w:val="24"/>
+        </w:rPr>
+        <w:t>Indizierungsregeln gleich wie Vektoren</w:t>
+      </w:r>
+    </w:p>
+    <w:p>
+      <w:pPr>
+        <w:pStyle w:val="Listenabsatz"/>
+        <w:rPr>
+          <w:sz w:val="24"/>
+          <w:szCs w:val="24"/>
+        </w:rPr>
+      </w:pPr>
+    </w:p>
+    <w:p>
+      <w:pPr>
+        <w:pStyle w:val="Listenabsatz"/>
+        <w:numPr>
+          <w:ilvl w:val="0"/>
+          <w:numId w:val="2"/>
+        </w:numPr>
+        <w:rPr>
+          <w:sz w:val="24"/>
+          <w:szCs w:val="24"/>
+        </w:rPr>
+      </w:pPr>
+      <w:r>
+        <w:rPr>
+          <w:sz w:val="24"/>
+          <w:szCs w:val="24"/>
+        </w:rPr>
+        <w:t>Zusammenfassung Matrizen (</w:t>
+      </w:r>
+      <w:proofErr w:type="spellStart"/>
+      <w:r>
+        <w:rPr>
+          <w:sz w:val="24"/>
+          <w:szCs w:val="24"/>
+        </w:rPr>
+        <w:t>Powerpoint</w:t>
+      </w:r>
+      <w:proofErr w:type="spellEnd"/>
+      <w:r>
+        <w:rPr>
+          <w:sz w:val="24"/>
+          <w:szCs w:val="24"/>
+        </w:rPr>
+        <w:t>)</w:t>
+      </w:r>
+    </w:p>
+    <w:p>
+      <w:pPr>
+        <w:pStyle w:val="Listenabsatz"/>
+        <w:rPr>
+          <w:sz w:val="24"/>
+          <w:szCs w:val="24"/>
+        </w:rPr>
+      </w:pPr>
+    </w:p>
+    <w:p>
+      <w:pPr>
+        <w:pStyle w:val="Listenabsatz"/>
+        <w:numPr>
+          <w:ilvl w:val="0"/>
+          <w:numId w:val="2"/>
+        </w:numPr>
+        <w:rPr>
+          <w:sz w:val="24"/>
+          <w:szCs w:val="24"/>
+        </w:rPr>
+      </w:pPr>
+      <w:r>
+        <w:rPr>
+          <w:sz w:val="24"/>
+          <w:szCs w:val="24"/>
+        </w:rPr>
+        <w:t>Übung Matrizen (PDF)</w:t>
+      </w:r>
+    </w:p>
+    <w:p>
+      <w:pPr>
+        <w:rPr>
+          <w:sz w:val="24"/>
+          <w:szCs w:val="24"/>
+        </w:rPr>
+      </w:pPr>
+      <w:r>
+        <w:rPr>
+          <w:sz w:val="24"/>
+          <w:szCs w:val="24"/>
+        </w:rPr>
+        <w:t>Dataframes</w:t>
+      </w:r>
+    </w:p>
+    <w:p>
+      <w:pPr>
+        <w:pStyle w:val="Listenabsatz"/>
+        <w:numPr>
+          <w:ilvl w:val="0"/>
+          <w:numId w:val="2"/>
+        </w:numPr>
+        <w:rPr>
+          <w:sz w:val="24"/>
+          <w:szCs w:val="24"/>
+        </w:rPr>
+      </w:pPr>
+      <w:r>
+        <w:rPr>
+          <w:sz w:val="24"/>
+          <w:szCs w:val="24"/>
+        </w:rPr>
+        <w:t xml:space="preserve">Erzeugung eines </w:t>
+      </w:r>
+      <w:proofErr w:type="spellStart"/>
+      <w:r>
+        <w:rPr>
+          <w:sz w:val="24"/>
+          <w:szCs w:val="24"/>
+        </w:rPr>
+        <w:t>Data.frames</w:t>
+      </w:r>
+      <w:proofErr w:type="spellEnd"/>
+      <w:r>
+        <w:rPr>
+          <w:sz w:val="24"/>
+          <w:szCs w:val="24"/>
+        </w:rPr>
+        <w:t xml:space="preserve"> aus einzelnen Vektoren</w:t>
+      </w:r>
+    </w:p>
+    <w:p>
+      <w:pPr>
+        <w:pStyle w:val="Listenabsatz"/>
+        <w:numPr>
+          <w:ilvl w:val="3"/>
+          <w:numId w:val="2"/>
+        </w:numPr>
+        <w:rPr>
+          <w:sz w:val="24"/>
+          <w:szCs w:val="24"/>
+        </w:rPr>
+      </w:pPr>
+      <w:r>
+        <w:rPr>
+          <w:sz w:val="24"/>
+          <w:szCs w:val="24"/>
+        </w:rPr>
+        <w:t>Fehler einbauen mit unterschiedlich langen Vektoren</w:t>
+      </w:r>
+    </w:p>
+    <w:p>
+      <w:pPr>
+        <w:pStyle w:val="Listenabsatz"/>
+        <w:ind w:left="2880"/>
+        <w:rPr>
+          <w:sz w:val="24"/>
+          <w:szCs w:val="24"/>
+        </w:rPr>
+      </w:pPr>
+    </w:p>
+    <w:p>
+      <w:pPr>
+        <w:pStyle w:val="Listenabsatz"/>
+        <w:numPr>
+          <w:ilvl w:val="0"/>
+          <w:numId w:val="2"/>
+        </w:numPr>
+        <w:rPr>
+          <w:sz w:val="24"/>
+          <w:szCs w:val="24"/>
+        </w:rPr>
+      </w:pPr>
+      <w:proofErr w:type="spellStart"/>
+      <w:r>
+        <w:rPr>
+          <w:sz w:val="24"/>
+          <w:szCs w:val="24"/>
+        </w:rPr>
+        <w:t>Data.frame</w:t>
+      </w:r>
+      <w:proofErr w:type="spellEnd"/>
+      <w:r>
+        <w:rPr>
+          <w:sz w:val="24"/>
+          <w:szCs w:val="24"/>
+        </w:rPr>
+        <w:t xml:space="preserve"> </w:t>
+      </w:r>
+      <w:proofErr w:type="gramStart"/>
+      <w:r>
+        <w:rPr>
+          <w:sz w:val="24"/>
+          <w:szCs w:val="24"/>
+        </w:rPr>
+        <w:t>aus der Environment</w:t>
+      </w:r>
+      <w:proofErr w:type="gramEnd"/>
+      <w:r>
+        <w:rPr>
+          <w:sz w:val="24"/>
+          <w:szCs w:val="24"/>
+        </w:rPr>
+        <w:t xml:space="preserve"> </w:t>
+      </w:r>
+      <w:r>
+        <w:rPr>
+          <w:sz w:val="24"/>
+          <w:szCs w:val="24"/>
+        </w:rPr>
+        <w:t>öffnen</w:t>
+      </w:r>
+    </w:p>
+    <w:p>
+      <w:pPr>
+        <w:pStyle w:val="Listenabsatz"/>
+        <w:rPr>
+          <w:sz w:val="24"/>
+          <w:szCs w:val="24"/>
+        </w:rPr>
+      </w:pPr>
+    </w:p>
+    <w:p>
+      <w:pPr>
+        <w:pStyle w:val="Listenabsatz"/>
+        <w:numPr>
+          <w:ilvl w:val="0"/>
+          <w:numId w:val="2"/>
+        </w:numPr>
+        <w:rPr>
+          <w:sz w:val="24"/>
+          <w:szCs w:val="24"/>
+        </w:rPr>
+      </w:pPr>
+      <w:r>
+        <w:rPr>
+          <w:sz w:val="24"/>
+          <w:szCs w:val="24"/>
+        </w:rPr>
+        <w:t>Indizierung wie Matrix zeigen</w:t>
+      </w:r>
+    </w:p>
+    <w:p>
+      <w:pPr>
+        <w:pStyle w:val="Listenabsatz"/>
+        <w:rPr>
+          <w:sz w:val="24"/>
+          <w:szCs w:val="24"/>
+        </w:rPr>
+      </w:pPr>
+    </w:p>
+    <w:p>
+      <w:pPr>
+        <w:pStyle w:val="Listenabsatz"/>
+        <w:numPr>
+          <w:ilvl w:val="0"/>
+          <w:numId w:val="2"/>
+        </w:numPr>
+        <w:rPr>
+          <w:sz w:val="24"/>
+          <w:szCs w:val="24"/>
+        </w:rPr>
+      </w:pPr>
+      <w:r>
+        <w:rPr>
+          <w:sz w:val="24"/>
+          <w:szCs w:val="24"/>
+        </w:rPr>
+        <w:t>Indizierung über Spaltennamen und $ oder [, „Name“]</w:t>
+      </w:r>
+    </w:p>
+    <w:p>
+      <w:pPr>
+        <w:pStyle w:val="Listenabsatz"/>
+        <w:rPr>
+          <w:sz w:val="24"/>
+          <w:szCs w:val="24"/>
+        </w:rPr>
+      </w:pPr>
+    </w:p>
+    <w:p>
+      <w:pPr>
+        <w:pStyle w:val="Listenabsatz"/>
+        <w:numPr>
+          <w:ilvl w:val="0"/>
+          <w:numId w:val="2"/>
+        </w:numPr>
+        <w:rPr>
+          <w:sz w:val="24"/>
+          <w:szCs w:val="24"/>
+        </w:rPr>
+      </w:pPr>
+      <w:r>
+        <w:rPr>
+          <w:sz w:val="24"/>
+          <w:szCs w:val="24"/>
+        </w:rPr>
+        <w:t>Funktion auf eine Spalte anwenden</w:t>
+      </w:r>
+    </w:p>
+    <w:p>
+      <w:pPr>
+        <w:pStyle w:val="Listenabsatz"/>
+        <w:numPr>
+          <w:ilvl w:val="3"/>
+          <w:numId w:val="2"/>
+        </w:numPr>
+        <w:rPr>
+          <w:sz w:val="24"/>
+          <w:szCs w:val="24"/>
+        </w:rPr>
+      </w:pPr>
+      <w:r>
+        <w:rPr>
+          <w:sz w:val="24"/>
+          <w:szCs w:val="24"/>
+        </w:rPr>
+        <w:t>Es ist viel übersichtlicher</w:t>
+      </w:r>
+    </w:p>
+    <w:p>
+      <w:pPr>
+        <w:pStyle w:val="Listenabsatz"/>
+        <w:ind w:left="2880"/>
+        <w:rPr>
+          <w:sz w:val="24"/>
+          <w:szCs w:val="24"/>
+        </w:rPr>
+      </w:pPr>
+    </w:p>
+    <w:p>
+      <w:pPr>
+        <w:pStyle w:val="Listenabsatz"/>
+        <w:numPr>
+          <w:ilvl w:val="0"/>
+          <w:numId w:val="2"/>
+        </w:numPr>
+        <w:rPr>
+          <w:sz w:val="24"/>
+          <w:szCs w:val="24"/>
+        </w:rPr>
+      </w:pPr>
+      <w:r>
+        <w:rPr>
+          <w:sz w:val="24"/>
+          <w:szCs w:val="24"/>
+        </w:rPr>
+        <w:t>Filtern mittels Indizierung</w:t>
+      </w:r>
+    </w:p>
+    <w:p>
+      <w:pPr>
+        <w:pStyle w:val="Listenabsatz"/>
+        <w:numPr>
+          <w:ilvl w:val="3"/>
+          <w:numId w:val="2"/>
+        </w:numPr>
+        <w:rPr>
+          <w:sz w:val="24"/>
+          <w:szCs w:val="24"/>
+        </w:rPr>
+      </w:pPr>
+      <w:r>
+        <w:rPr>
+          <w:sz w:val="24"/>
+          <w:szCs w:val="24"/>
+        </w:rPr>
+        <w:t>Auch übersichtliche</w:t>
+      </w:r>
+      <w:r>
+        <w:rPr>
+          <w:sz w:val="24"/>
+          <w:szCs w:val="24"/>
+        </w:rPr>
+        <w:t>r</w:t>
+      </w:r>
+    </w:p>
+    <w:p>
+      <w:pPr>
+        <w:pStyle w:val="Listenabsatz"/>
+        <w:ind w:left="2880"/>
+        <w:rPr>
+          <w:sz w:val="24"/>
+          <w:szCs w:val="24"/>
+        </w:rPr>
+      </w:pPr>
+    </w:p>
+    <w:p>
+      <w:pPr>
+        <w:pStyle w:val="Listenabsatz"/>
+        <w:numPr>
+          <w:ilvl w:val="0"/>
+          <w:numId w:val="2"/>
+        </w:numPr>
+        <w:rPr>
+          <w:sz w:val="24"/>
+          <w:szCs w:val="24"/>
+        </w:rPr>
+      </w:pPr>
+      <w:r>
+        <w:rPr>
+          <w:sz w:val="24"/>
+          <w:szCs w:val="24"/>
+        </w:rPr>
+        <w:t>Spalten hinzufügen</w:t>
+      </w:r>
+    </w:p>
+    <w:p>
+      <w:pPr>
+        <w:pStyle w:val="Listenabsatz"/>
+        <w:numPr>
+          <w:ilvl w:val="1"/>
+          <w:numId w:val="2"/>
+        </w:numPr>
+        <w:rPr>
+          <w:sz w:val="24"/>
+          <w:szCs w:val="24"/>
+        </w:rPr>
+      </w:pPr>
+      <w:r>
+        <w:rPr>
+          <w:sz w:val="24"/>
+          <w:szCs w:val="24"/>
+        </w:rPr>
+        <w:t>Mit nur einem Wert</w:t>
+      </w:r>
+    </w:p>
+    <w:p>
+      <w:pPr>
+        <w:pStyle w:val="Listenabsatz"/>
+        <w:numPr>
+          <w:ilvl w:val="1"/>
+          <w:numId w:val="2"/>
+        </w:numPr>
+        <w:rPr>
+          <w:sz w:val="24"/>
+          <w:szCs w:val="24"/>
+        </w:rPr>
+      </w:pPr>
+      <w:r>
+        <w:rPr>
+          <w:sz w:val="24"/>
+          <w:szCs w:val="24"/>
+        </w:rPr>
+        <w:t>Mit unterschiedlichen Werten</w:t>
+      </w:r>
+    </w:p>
+    <w:p>
+      <w:pPr>
+        <w:pStyle w:val="Listenabsatz"/>
+        <w:ind w:left="1440"/>
+        <w:rPr>
+          <w:sz w:val="24"/>
+          <w:szCs w:val="24"/>
+        </w:rPr>
+      </w:pPr>
+    </w:p>
+    <w:p>
+      <w:pPr>
+        <w:pStyle w:val="Listenabsatz"/>
+        <w:numPr>
+          <w:ilvl w:val="0"/>
+          <w:numId w:val="2"/>
+        </w:numPr>
+        <w:rPr>
+          <w:sz w:val="24"/>
+          <w:szCs w:val="24"/>
+        </w:rPr>
+      </w:pPr>
+      <w:r>
+        <w:rPr>
+          <w:sz w:val="24"/>
+          <w:szCs w:val="24"/>
+        </w:rPr>
+        <w:t>Daten einlesen mittels ‚Import Dataset‘</w:t>
+      </w:r>
+    </w:p>
+    <w:p>
+      <w:pPr>
+        <w:pStyle w:val="Listenabsatz"/>
+        <w:numPr>
+          <w:ilvl w:val="1"/>
+          <w:numId w:val="2"/>
+        </w:numPr>
+        <w:rPr>
+          <w:sz w:val="24"/>
+          <w:szCs w:val="24"/>
+        </w:rPr>
+      </w:pPr>
+      <w:r>
+        <w:rPr>
+          <w:sz w:val="24"/>
+          <w:szCs w:val="24"/>
+        </w:rPr>
+        <w:t>Import Befehl lässt sich aus der Konsole ins Skript kopieren</w:t>
+      </w:r>
+    </w:p>
+    <w:p>
+      <w:pPr>
+        <w:pStyle w:val="Listenabsatz"/>
+        <w:numPr>
+          <w:ilvl w:val="3"/>
+          <w:numId w:val="2"/>
+        </w:numPr>
+        <w:rPr>
+          <w:sz w:val="24"/>
+          <w:szCs w:val="24"/>
+        </w:rPr>
+      </w:pPr>
+      <w:r>
+        <w:rPr>
+          <w:sz w:val="24"/>
+          <w:szCs w:val="24"/>
+        </w:rPr>
+        <w:t>Falls das Skript neu laufen muss ist keine manuelle Eingabe notwendig</w:t>
+      </w:r>
+    </w:p>
+    <w:p>
+      <w:pPr>
+        <w:pStyle w:val="Listenabsatz"/>
+        <w:ind w:left="2880"/>
+        <w:rPr>
+          <w:sz w:val="24"/>
+          <w:szCs w:val="24"/>
+        </w:rPr>
+      </w:pPr>
+    </w:p>
+    <w:p>
+      <w:pPr>
+        <w:pStyle w:val="Listenabsatz"/>
+        <w:numPr>
+          <w:ilvl w:val="0"/>
+          <w:numId w:val="2"/>
+        </w:numPr>
+        <w:rPr>
+          <w:sz w:val="24"/>
+          <w:szCs w:val="24"/>
+        </w:rPr>
+      </w:pPr>
+      <w:r>
+        <w:rPr>
+          <w:sz w:val="24"/>
+          <w:szCs w:val="24"/>
+        </w:rPr>
+        <w:t xml:space="preserve">Daten kurz anschauen mit </w:t>
+      </w:r>
+      <w:proofErr w:type="spellStart"/>
+      <w:proofErr w:type="gramStart"/>
+      <w:r>
+        <w:rPr>
+          <w:sz w:val="24"/>
+          <w:szCs w:val="24"/>
+        </w:rPr>
+        <w:t>head</w:t>
+      </w:r>
+      <w:proofErr w:type="spellEnd"/>
+      <w:r>
+        <w:rPr>
+          <w:sz w:val="24"/>
+          <w:szCs w:val="24"/>
+        </w:rPr>
+        <w:t>( )</w:t>
+      </w:r>
+      <w:proofErr w:type="gramEnd"/>
+      <w:r>
+        <w:rPr>
+          <w:sz w:val="24"/>
+          <w:szCs w:val="24"/>
+        </w:rPr>
+        <w:t xml:space="preserve"> oder </w:t>
+      </w:r>
+      <w:proofErr w:type="spellStart"/>
+      <w:r>
+        <w:rPr>
+          <w:sz w:val="24"/>
+          <w:szCs w:val="24"/>
+        </w:rPr>
+        <w:t>RStudio</w:t>
+      </w:r>
+      <w:proofErr w:type="spellEnd"/>
+      <w:r>
+        <w:rPr>
+          <w:sz w:val="24"/>
+          <w:szCs w:val="24"/>
+        </w:rPr>
+        <w:t xml:space="preserve"> Viewer</w:t>
+      </w:r>
+    </w:p>
+    <w:p>
+      <w:pPr>
+        <w:pStyle w:val="Listenabsatz"/>
+        <w:rPr>
+          <w:sz w:val="24"/>
+          <w:szCs w:val="24"/>
+        </w:rPr>
+      </w:pPr>
+    </w:p>
+    <w:p>
+      <w:pPr>
+        <w:pStyle w:val="Listenabsatz"/>
+        <w:numPr>
+          <w:ilvl w:val="0"/>
+          <w:numId w:val="2"/>
+        </w:numPr>
+        <w:rPr>
+          <w:sz w:val="24"/>
+          <w:szCs w:val="24"/>
+        </w:rPr>
+      </w:pPr>
+      <w:r>
+        <w:rPr>
+          <w:sz w:val="24"/>
+          <w:szCs w:val="24"/>
+        </w:rPr>
+        <w:t>Zusammenfassung Dataframes (</w:t>
+      </w:r>
+      <w:proofErr w:type="spellStart"/>
+      <w:r>
+        <w:rPr>
+          <w:sz w:val="24"/>
+          <w:szCs w:val="24"/>
+        </w:rPr>
+        <w:t>Powerpoint</w:t>
+      </w:r>
+      <w:proofErr w:type="spellEnd"/>
+      <w:r>
+        <w:rPr>
+          <w:sz w:val="24"/>
+          <w:szCs w:val="24"/>
+        </w:rPr>
+        <w:t>)</w:t>
+      </w:r>
+    </w:p>
+    <w:p>
+      <w:pPr>
+        <w:pStyle w:val="Listenabsatz"/>
+        <w:rPr>
+          <w:sz w:val="24"/>
+          <w:szCs w:val="24"/>
+        </w:rPr>
+      </w:pPr>
+    </w:p>
+    <w:p>
+      <w:pPr>
+        <w:pStyle w:val="Listenabsatz"/>
+        <w:numPr>
+          <w:ilvl w:val="0"/>
+          <w:numId w:val="2"/>
+        </w:numPr>
+        <w:rPr>
+          <w:sz w:val="24"/>
+          <w:szCs w:val="24"/>
+        </w:rPr>
+      </w:pPr>
+      <w:r>
+        <w:rPr>
+          <w:sz w:val="24"/>
+          <w:szCs w:val="24"/>
+        </w:rPr>
+        <w:t>Übung Dataframes und Pirates Datensatz</w:t>
+      </w:r>
     </w:p>
     <w:sectPr>
       <w:pgSz w:w="11906" w:h="16838"/>

</xml_diff>